<commit_message>
Committing backend changes for  course history and tutorial history
</commit_message>
<xml_diff>
--- a/docs/01 UPL _TUTORIALS 2025 CAP .docx
+++ b/docs/01 UPL _TUTORIALS 2025 CAP .docx
@@ -524,8 +524,14 @@
         </w:numPr>
         <w:spacing w:before="100" w:beforeAutospacing="1" w:after="100" w:afterAutospacing="1" w:line="240" w:lineRule="auto"/>
         <w:jc w:val="both"/>
-      </w:pPr>
-      <w:r>
+        <w:rPr>
+          <w:highlight w:val="yellow"/>
+        </w:rPr>
+      </w:pPr>
+      <w:r>
+        <w:rPr>
+          <w:highlight w:val="yellow"/>
+        </w:rPr>
         <w:t>Edit or delete their own content.</w:t>
       </w:r>
     </w:p>
@@ -752,6 +758,9 @@
               <w:jc w:val="both"/>
             </w:pPr>
             <w:r>
+              <w:rPr>
+                <w:highlight w:val="yellow"/>
+              </w:rPr>
               <w:t>CRUD operations for courses and tutorials.</w:t>
             </w:r>
           </w:p>
@@ -828,7 +837,16 @@
               <w:jc w:val="both"/>
             </w:pPr>
             <w:r>
-              <w:t>Manage instructors, approve content, oversee analytics.</w:t>
+              <w:t xml:space="preserve">Manage instructors, approve content, </w:t>
+            </w:r>
+            <w:r>
+              <w:rPr>
+                <w:highlight w:val="yellow"/>
+              </w:rPr>
+              <w:t>oversee analytics</w:t>
+            </w:r>
+            <w:r>
+              <w:t>.</w:t>
             </w:r>
           </w:p>
         </w:tc>
@@ -2534,6 +2552,8 @@
             </w:r>
           </w:p>
         </w:tc>
+        <w:bookmarkStart w:id="0" w:name="_GoBack"/>
+        <w:bookmarkEnd w:id="0"/>
       </w:tr>
       <w:tr>
         <w:trPr>
@@ -4275,8 +4295,6 @@
             <w:r>
               <w:t>Fetch all active courses</w:t>
             </w:r>
-            <w:bookmarkStart w:id="0" w:name="_GoBack"/>
-            <w:bookmarkEnd w:id="0"/>
           </w:p>
         </w:tc>
       </w:tr>
@@ -4964,6 +4982,23 @@
         <w:jc w:val="both"/>
       </w:pPr>
       <w:r>
+        <w:tab/>
+      </w:r>
+      <w:r>
+        <w:tab/>
+      </w:r>
+      <w:r>
+        <w:rPr>
+          <w:highlight w:val="yellow"/>
+        </w:rPr>
+        <w:t>UserController.java</w:t>
+      </w:r>
+    </w:p>
+    <w:p>
+      <w:pPr>
+        <w:jc w:val="both"/>
+      </w:pPr>
+      <w:r>
         <w:t>|   |   |   |   |-- service/</w:t>
       </w:r>
     </w:p>
@@ -5004,6 +5039,7 @@
         <w:jc w:val="both"/>
       </w:pPr>
       <w:r>
+        <w:lastRenderedPageBreak/>
         <w:t>|   |   |   |   |   |-- CourseRepository.java</w:t>
       </w:r>
     </w:p>
@@ -5012,7 +5048,6 @@
         <w:jc w:val="both"/>
       </w:pPr>
       <w:r>
-        <w:lastRenderedPageBreak/>
         <w:t>|   |   |   |   |   |-- TutorialRepository.java</w:t>
       </w:r>
     </w:p>
@@ -5648,7 +5683,7 @@
             <w:bCs/>
             <w:noProof/>
           </w:rPr>
-          <w:t>6</w:t>
+          <w:t>4</w:t>
         </w:r>
         <w:r>
           <w:rPr>
@@ -5791,7 +5826,7 @@
             </wp:anchor>
           </w:drawing>
         </mc:Choice>
-        <mc:Fallback xmlns:w16se="http://schemas.microsoft.com/office/word/2015/wordml/symex" xmlns:w16cid="http://schemas.microsoft.com/office/word/2016/wordml/cid" xmlns:am3d="http://schemas.microsoft.com/office/drawing/2017/model3d" xmlns:aink="http://schemas.microsoft.com/office/drawing/2016/ink" xmlns:cx8="http://schemas.microsoft.com/office/drawing/2016/5/14/chartex" xmlns:cx7="http://schemas.microsoft.com/office/drawing/2016/5/13/chartex" xmlns:cx6="http://schemas.microsoft.com/office/drawing/2016/5/12/chartex" xmlns:cx5="http://schemas.microsoft.com/office/drawing/2016/5/11/chartex" xmlns:cx4="http://schemas.microsoft.com/office/drawing/2016/5/10/chartex" xmlns:cx3="http://schemas.microsoft.com/office/drawing/2016/5/9/chartex" xmlns:cx2="http://schemas.microsoft.com/office/drawing/2015/10/21/chartex" xmlns:cx1="http://schemas.microsoft.com/office/drawing/2015/9/8/chartex" xmlns:cx="http://schemas.microsoft.com/office/drawing/2014/chartex">
+        <mc:Fallback xmlns:cx="http://schemas.microsoft.com/office/drawing/2014/chartex" xmlns:cx1="http://schemas.microsoft.com/office/drawing/2015/9/8/chartex" xmlns:cx2="http://schemas.microsoft.com/office/drawing/2015/10/21/chartex" xmlns:cx3="http://schemas.microsoft.com/office/drawing/2016/5/9/chartex" xmlns:cx4="http://schemas.microsoft.com/office/drawing/2016/5/10/chartex" xmlns:cx5="http://schemas.microsoft.com/office/drawing/2016/5/11/chartex" xmlns:cx6="http://schemas.microsoft.com/office/drawing/2016/5/12/chartex" xmlns:cx7="http://schemas.microsoft.com/office/drawing/2016/5/13/chartex" xmlns:cx8="http://schemas.microsoft.com/office/drawing/2016/5/14/chartex" xmlns:aink="http://schemas.microsoft.com/office/drawing/2016/ink" xmlns:am3d="http://schemas.microsoft.com/office/drawing/2017/model3d" xmlns:w16cid="http://schemas.microsoft.com/office/word/2016/wordml/cid" xmlns:w16se="http://schemas.microsoft.com/office/word/2015/wordml/symex">
           <w:pict>
             <v:rect w14:anchorId="6FCDA1BF" id="Rectangle 222" o:spid="_x0000_s1026" style="position:absolute;margin-left:0;margin-top:0;width:580.8pt;height:752.4pt;z-index:251659264;visibility:visible;mso-wrap-style:square;mso-width-percent:950;mso-height-percent:950;mso-wrap-distance-left:9pt;mso-wrap-distance-top:0;mso-wrap-distance-right:9pt;mso-wrap-distance-bottom:0;mso-position-horizontal:center;mso-position-horizontal-relative:page;mso-position-vertical:center;mso-position-vertical-relative:page;mso-width-percent:950;mso-height-percent:950;mso-width-relative:page;mso-height-relative:page;v-text-anchor:middle" o:gfxdata="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" filled="f" strokecolor="#747070 [1614]" strokeweight="1.25pt">
               <w10:wrap anchorx="page" anchory="page"/>

</xml_diff>